<commit_message>
Actualice la respuesa 6 del proyecto integradro
</commit_message>
<xml_diff>
--- a/Modulo_5_G82/Semana_4_25-31_mayo/Recursos/M05_G14_S4_PI_WORD.docx
+++ b/Modulo_5_G82/Semana_4_25-31_mayo/Recursos/M05_G14_S4_PI_WORD.docx
@@ -585,8 +585,10 @@
               <w:rPr>
                 <w:rFonts w:hint="default" w:ascii="Arial" w:hAnsi="Arial" w:eastAsia="Arial" w:cs="Arial"/>
               </w:rPr>
-              <w:t>Para realizar esta investigación consulté páginas web de organizaciones internacionales y nacionales confiables como la UNESCO, la CEPAL y el INEGI. Estas instituciones publican estudios y datos sobre el impacto de la tecnología en la sociedad y en México. Utilicé palabras clave como "inteligencia artificial en México", "empleos e IA en América Latina" y "educación e inteligencia artificial" para encontrar información relacionada con el tema. También revisé los materiales del módulo sobre cómo hacer investigación documental.</w:t>
+              <w:t>Para realizar esta investigación utilicé la técnica de investigación documental, que consiste en buscar información en distintos tipos de documentos. En este caso, consulté sistemas de información computarizada, es decir, páginas web de organizaciones internacionales y nacionales confiables como la UNESCO, la CEPAL y el INEGI, que publican estudios y estadísticas sobre el impacto de la tecnología en la sociedad y en México. Utilicé palabras clave como "inteligencia artificial en México", "empleos e IA en América Latina" y "educación e inteligencia artificial" para encontrar la información relevante. Elegí esta técnica porque mi investigación es de tipo aplicada: busca entender cómo un fenómeno real (la IA) está afectando a mi entorno, y para eso necesito consultar documentos con datos e investigaciones ya realizadas.</w:t>
             </w:r>
+            <w:bookmarkStart w:id="0" w:name="_GoBack"/>
+            <w:bookmarkEnd w:id="0"/>
           </w:p>
         </w:tc>
       </w:tr>
@@ -1165,16 +1167,8 @@
               <w:rPr>
                 <w:rFonts w:hint="default" w:ascii="Arial" w:hAnsi="Arial" w:eastAsia="Arial" w:cs="Arial"/>
               </w:rPr>
-              <w:t>La inteligencia artificial y los inventos que está generando en México</w:t>
+              <w:t>La inteligencia artificial y los inventos que está generando en México.</w:t>
             </w:r>
-            <w:r>
-              <w:rPr>
-                <w:rFonts w:hint="default" w:ascii="Arial" w:hAnsi="Arial" w:eastAsia="Arial" w:cs="Arial"/>
-              </w:rPr>
-              <w:t>.</w:t>
-            </w:r>
-            <w:bookmarkStart w:id="0" w:name="_GoBack"/>
-            <w:bookmarkEnd w:id="0"/>
           </w:p>
           <w:p>
             <w:pPr>

</xml_diff>

<commit_message>
Cambio en las respuestas del ensayo
</commit_message>
<xml_diff>
--- a/Modulo_5_G82/Semana_4_25-31_mayo/Recursos/M05_G14_S4_PI_WORD.docx
+++ b/Modulo_5_G82/Semana_4_25-31_mayo/Recursos/M05_G14_S4_PI_WORD.docx
@@ -383,12 +383,52 @@
               <w:rPr>
                 <w:rFonts w:hint="default" w:ascii="Arial" w:hAnsi="Arial" w:eastAsia="Arial" w:cs="Arial"/>
               </w:rPr>
-              <w:t>La inteligencia artificial ha generado inventos tecnológicos que están transformando el trabajo y la educación en México, trayendo tanto oportunidades como retos para la sociedad</w:t>
+              <w:t>La inteligencia artificial ha dado origen a inventos como las plataformas educativas digitales y los sistemas que automatizan tareas de trabajo, gracias a los avances en informática y programación, lo cual está cambiando la manera en que las personas estudian y trabajan en México.</w:t>
             </w:r>
           </w:p>
         </w:tc>
       </w:tr>
     </w:tbl>
+    <w:p>
+      <w:pPr>
+        <w:pStyle w:val="27"/>
+        <w:spacing w:line="360" w:lineRule="auto"/>
+        <w:jc w:val="both"/>
+        <w:rPr>
+          <w:rFonts w:ascii="Arial" w:hAnsi="Arial" w:eastAsia="Arial" w:cs="Arial"/>
+        </w:rPr>
+      </w:pPr>
+    </w:p>
+    <w:p>
+      <w:pPr>
+        <w:pStyle w:val="27"/>
+        <w:spacing w:line="360" w:lineRule="auto"/>
+        <w:jc w:val="both"/>
+        <w:rPr>
+          <w:rFonts w:ascii="Arial" w:hAnsi="Arial" w:eastAsia="Arial" w:cs="Arial"/>
+        </w:rPr>
+      </w:pPr>
+    </w:p>
+    <w:p>
+      <w:pPr>
+        <w:pStyle w:val="27"/>
+        <w:spacing w:line="360" w:lineRule="auto"/>
+        <w:jc w:val="both"/>
+        <w:rPr>
+          <w:rFonts w:ascii="Arial" w:hAnsi="Arial" w:eastAsia="Arial" w:cs="Arial"/>
+        </w:rPr>
+      </w:pPr>
+    </w:p>
+    <w:p>
+      <w:pPr>
+        <w:pStyle w:val="27"/>
+        <w:spacing w:line="360" w:lineRule="auto"/>
+        <w:jc w:val="both"/>
+        <w:rPr>
+          <w:rFonts w:ascii="Arial" w:hAnsi="Arial" w:eastAsia="Arial" w:cs="Arial"/>
+        </w:rPr>
+      </w:pPr>
+    </w:p>
     <w:p>
       <w:pPr>
         <w:pStyle w:val="27"/>
@@ -477,7 +517,7 @@
               <w:rPr>
                 <w:rFonts w:hint="default" w:ascii="Arial" w:hAnsi="Arial" w:eastAsia="Arial" w:cs="Arial"/>
               </w:rPr>
-              <w:t>Informática: estudia cómo funcionan los sistemas de inteligencia artificial y los inventos tecnológicos que genera.</w:t>
+              <w:t>Las dos ciencias desde las que abordaré el tema son la informática y la sociología.</w:t>
             </w:r>
           </w:p>
           <w:p>
@@ -485,14 +525,29 @@
               <w:spacing w:line="360" w:lineRule="auto"/>
               <w:jc w:val="both"/>
               <w:rPr>
-                <w:rFonts w:ascii="Arial" w:hAnsi="Arial" w:eastAsia="Arial" w:cs="Arial"/>
+                <w:rFonts w:hint="default" w:ascii="Arial" w:hAnsi="Arial" w:eastAsia="Arial" w:cs="Arial"/>
               </w:rPr>
             </w:pPr>
             <w:r>
               <w:rPr>
                 <w:rFonts w:hint="default" w:ascii="Arial" w:hAnsi="Arial" w:eastAsia="Arial" w:cs="Arial"/>
               </w:rPr>
-              <w:t>Sociología: estudia cómo esos inventos tecnológicos están cambiando la forma en que las personas viven, trabajan y se relacionan entre sí.</w:t>
+              <w:t>La informática estudia cómo funcionan los programas de computadora y los algoritmos, ya que gracias a esa ciencia fue posible desarrollar la inteligencia artificial y los inventos tecnológicos que han surgido de ella.</w:t>
+            </w:r>
+          </w:p>
+          <w:p>
+            <w:pPr>
+              <w:spacing w:line="360" w:lineRule="auto"/>
+              <w:jc w:val="both"/>
+              <w:rPr>
+                <w:rFonts w:ascii="Arial" w:hAnsi="Arial" w:eastAsia="Arial" w:cs="Arial"/>
+              </w:rPr>
+            </w:pPr>
+            <w:r>
+              <w:rPr>
+                <w:rFonts w:hint="default" w:ascii="Arial" w:hAnsi="Arial" w:eastAsia="Arial" w:cs="Arial"/>
+              </w:rPr>
+              <w:t>La sociología estudia cómo los cambios tecnológicos afectan la manera en que las personas viven y se organizan en la sociedad, por eso me parece importante para entender cómo los inventos de la IA están cambiando el trabajo y la educación en México.</w:t>
             </w:r>
           </w:p>
         </w:tc>
@@ -587,8 +642,6 @@
               </w:rPr>
               <w:t>Para realizar esta investigación utilicé la técnica de investigación documental, que consiste en buscar información en distintos tipos de documentos. En este caso, consulté sistemas de información computarizada, es decir, páginas web de organizaciones internacionales y nacionales confiables como la UNESCO, la CEPAL y el INEGI, que publican estudios y estadísticas sobre el impacto de la tecnología en la sociedad y en México. Utilicé palabras clave como "inteligencia artificial en México", "empleos e IA en América Latina" y "educación e inteligencia artificial" para encontrar la información relevante. Elegí esta técnica porque mi investigación es de tipo aplicada: busca entender cómo un fenómeno real (la IA) está afectando a mi entorno, y para eso necesito consultar documentos con datos e investigaciones ya realizadas.</w:t>
             </w:r>
-            <w:bookmarkStart w:id="0" w:name="_GoBack"/>
-            <w:bookmarkEnd w:id="0"/>
           </w:p>
         </w:tc>
       </w:tr>
@@ -794,7 +847,7 @@
               <w:rPr>
                 <w:rFonts w:hint="default" w:ascii="Arial" w:hAnsi="Arial" w:eastAsia="Arial" w:cs="Arial"/>
               </w:rPr>
-              <w:t>Argumento 1 — La IA genera inventos que mejoran la educación en México</w:t>
+              <w:t>Premisa 1: Gracias a la IA se han creado inventos como plataformas de aprendizaje en línea, traductores automáticos y asistentes virtuales que ayudan a los estudiantes a aprender de forma más rápida y personalizada.</w:t>
             </w:r>
           </w:p>
           <w:p>
@@ -805,20 +858,11 @@
                 <w:rFonts w:hint="default" w:ascii="Arial" w:hAnsi="Arial" w:eastAsia="Arial" w:cs="Arial"/>
               </w:rPr>
             </w:pPr>
-          </w:p>
-          <w:p>
-            <w:pPr>
-              <w:spacing w:line="360" w:lineRule="auto"/>
-              <w:jc w:val="both"/>
-              <w:rPr>
-                <w:rFonts w:hint="default" w:ascii="Arial" w:hAnsi="Arial" w:eastAsia="Arial" w:cs="Arial"/>
-              </w:rPr>
-            </w:pPr>
             <w:r>
               <w:rPr>
                 <w:rFonts w:hint="default" w:ascii="Arial" w:hAnsi="Arial" w:eastAsia="Arial" w:cs="Arial"/>
               </w:rPr>
-              <w:t>Premisa 1: La IA ha dado origen a inventos como plataformas de aprendizaje personalizado, traductores automáticos y asistentes virtuales que apoyan a los estudiantes dentro y fuera del salón de clases.</w:t>
+              <w:t>Premisa 2: Según la UNESCO (2021), la IA puede mejorar el acceso a la educación en países en desarrollo como México, ya que hay zonas donde hay muy pocos maestros o recursos educativos.</w:t>
             </w:r>
           </w:p>
           <w:p>
@@ -826,29 +870,14 @@
               <w:spacing w:line="360" w:lineRule="auto"/>
               <w:jc w:val="both"/>
               <w:rPr>
-                <w:rFonts w:hint="default" w:ascii="Arial" w:hAnsi="Arial" w:eastAsia="Arial" w:cs="Arial"/>
+                <w:rFonts w:ascii="Arial" w:hAnsi="Arial" w:eastAsia="Arial" w:cs="Arial"/>
               </w:rPr>
             </w:pPr>
             <w:r>
               <w:rPr>
                 <w:rFonts w:hint="default" w:ascii="Arial" w:hAnsi="Arial" w:eastAsia="Arial" w:cs="Arial"/>
               </w:rPr>
-              <w:t>Premisa 2: La UNESCO (2021) señala que la IA tiene el potencial de mejorar el acceso a la educación en países en desarrollo, donde hay zonas con pocos maestros o recursos educativos limitados, como ocurre en varias regiones de México.</w:t>
-            </w:r>
-          </w:p>
-          <w:p>
-            <w:pPr>
-              <w:spacing w:line="360" w:lineRule="auto"/>
-              <w:jc w:val="both"/>
-              <w:rPr>
-                <w:rFonts w:ascii="Arial" w:hAnsi="Arial" w:eastAsia="Arial" w:cs="Arial"/>
-              </w:rPr>
-            </w:pPr>
-            <w:r>
-              <w:rPr>
-                <w:rFonts w:hint="default" w:ascii="Arial" w:hAnsi="Arial" w:eastAsia="Arial" w:cs="Arial"/>
-              </w:rPr>
-              <w:t>Conclusión: Por lo tanto, los inventos generados por la IA pueden ayudar a que más mexicanos tengan acceso a una mejor educación, especialmente en comunidades donde las oportunidades son menores.</w:t>
+              <w:t>Conclusión: Por eso considero que los inventos que ha generado la IA pueden ayudar a que más mexicanos tengan acceso a una mejor educación, especialmente en comunidades donde las oportunidades son muy pocas</w:t>
             </w:r>
           </w:p>
         </w:tc>
@@ -907,7 +936,7 @@
               <w:rPr>
                 <w:rFonts w:hint="default" w:ascii="Arial" w:hAnsi="Arial" w:eastAsia="Arial" w:cs="Arial"/>
               </w:rPr>
-              <w:t>Argumento 2 — La IA está cambiando el mercado laboral en México</w:t>
+              <w:t>Premisa 1: La IA ha generado inventos como robots industriales y sistemas automáticos que realizan tareas que antes hacían las personas, lo que está afectando muchos empleos en México.</w:t>
             </w:r>
           </w:p>
           <w:p>
@@ -918,20 +947,11 @@
                 <w:rFonts w:hint="default" w:ascii="Arial" w:hAnsi="Arial" w:eastAsia="Arial" w:cs="Arial"/>
               </w:rPr>
             </w:pPr>
-          </w:p>
-          <w:p>
-            <w:pPr>
-              <w:spacing w:line="360" w:lineRule="auto"/>
-              <w:jc w:val="both"/>
-              <w:rPr>
-                <w:rFonts w:hint="default" w:ascii="Arial" w:hAnsi="Arial" w:eastAsia="Arial" w:cs="Arial"/>
-              </w:rPr>
-            </w:pPr>
             <w:r>
               <w:rPr>
                 <w:rFonts w:hint="default" w:ascii="Arial" w:hAnsi="Arial" w:eastAsia="Arial" w:cs="Arial"/>
               </w:rPr>
-              <w:t>Premisa 1: La IA ha creado inventos como robots industriales, sistemas automatizados y programas que realizan tareas que antes hacían las personas, lo que está modificando muchos empleos.</w:t>
+              <w:t>Premisa 2: De acuerdo con la CEPAL (2020), en México y América Latina millones de empleos con tareas repetitivas están en riesgo de ser reemplazados por esta tecnología.</w:t>
             </w:r>
           </w:p>
           <w:p>
@@ -939,29 +959,14 @@
               <w:spacing w:line="360" w:lineRule="auto"/>
               <w:jc w:val="both"/>
               <w:rPr>
-                <w:rFonts w:hint="default" w:ascii="Arial" w:hAnsi="Arial" w:eastAsia="Arial" w:cs="Arial"/>
+                <w:rFonts w:ascii="Arial" w:hAnsi="Arial" w:eastAsia="Arial" w:cs="Arial"/>
               </w:rPr>
             </w:pPr>
             <w:r>
               <w:rPr>
                 <w:rFonts w:hint="default" w:ascii="Arial" w:hAnsi="Arial" w:eastAsia="Arial" w:cs="Arial"/>
               </w:rPr>
-              <w:t>Premisa 2: La Comisión Económica para América Latina y el Caribe (CEPAL, 2020) advierte que en México y América Latina, millones de empleos con tareas repetitivas están en riesgo de ser reemplazados por tecnología automatizada.</w:t>
-            </w:r>
-          </w:p>
-          <w:p>
-            <w:pPr>
-              <w:spacing w:line="360" w:lineRule="auto"/>
-              <w:jc w:val="both"/>
-              <w:rPr>
-                <w:rFonts w:ascii="Arial" w:hAnsi="Arial" w:eastAsia="Arial" w:cs="Arial"/>
-              </w:rPr>
-            </w:pPr>
-            <w:r>
-              <w:rPr>
-                <w:rFonts w:hint="default" w:ascii="Arial" w:hAnsi="Arial" w:eastAsia="Arial" w:cs="Arial"/>
-              </w:rPr>
-              <w:t>Conclusión: Por lo tanto, es necesario que los mexicanos desarrollen nuevas habilidades para adaptarse a un mundo donde los inventos de IA están transformando el trabajo.</w:t>
+              <w:t>Conclusión: Por eso, los inventos de la IA están transformando el mercado laboral en México y muchas personas podrían perder su trabajo, ya que sus actividades pueden ser realizadas por máquinas.</w:t>
             </w:r>
           </w:p>
         </w:tc>
@@ -1020,7 +1025,7 @@
               <w:rPr>
                 <w:rFonts w:hint="default" w:ascii="Arial" w:hAnsi="Arial" w:eastAsia="Arial" w:cs="Arial"/>
               </w:rPr>
-              <w:t>Argumento 3 — La IA genera inventos médicos que pueden reducir desigualdades en México</w:t>
+              <w:t>Premisa 1: La IA ha dado origen a inventos médicos como sistemas que detectan enfermedades, programas que ayudan a crear medicamentos y herramientas que apoyan a los médicos en sus diagnósticos.</w:t>
             </w:r>
           </w:p>
           <w:p>
@@ -1031,20 +1036,11 @@
                 <w:rFonts w:hint="default" w:ascii="Arial" w:hAnsi="Arial" w:eastAsia="Arial" w:cs="Arial"/>
               </w:rPr>
             </w:pPr>
-          </w:p>
-          <w:p>
-            <w:pPr>
-              <w:spacing w:line="360" w:lineRule="auto"/>
-              <w:jc w:val="both"/>
-              <w:rPr>
-                <w:rFonts w:hint="default" w:ascii="Arial" w:hAnsi="Arial" w:eastAsia="Arial" w:cs="Arial"/>
-              </w:rPr>
-            </w:pPr>
             <w:r>
               <w:rPr>
                 <w:rFonts w:hint="default" w:ascii="Arial" w:hAnsi="Arial" w:eastAsia="Arial" w:cs="Arial"/>
               </w:rPr>
-              <w:t>Premisa 1: La IA ha generado inventos médicos como sistemas que detectan enfermedades a partir de imágenes, programas que ayudan a desarrollar medicamentos y herramientas que apoyan a los médicos en sus diagnósticos.</w:t>
+              <w:t>Premisa 2: Según el INEGI (2023), en México hay muchas comunidades rurales donde el acceso a médicos especialistas es muy limitado, lo que afecta la salud de millones de personas.</w:t>
             </w:r>
           </w:p>
           <w:p>
@@ -1052,29 +1048,14 @@
               <w:spacing w:line="360" w:lineRule="auto"/>
               <w:jc w:val="both"/>
               <w:rPr>
-                <w:rFonts w:hint="default" w:ascii="Arial" w:hAnsi="Arial" w:eastAsia="Arial" w:cs="Arial"/>
+                <w:rFonts w:ascii="Arial" w:hAnsi="Arial" w:eastAsia="Arial" w:cs="Arial"/>
               </w:rPr>
             </w:pPr>
             <w:r>
               <w:rPr>
                 <w:rFonts w:hint="default" w:ascii="Arial" w:hAnsi="Arial" w:eastAsia="Arial" w:cs="Arial"/>
               </w:rPr>
-              <w:t>Premisa 2: Según el INEGI (2023), en México existen comunidades rurales donde el acceso a médicos especialistas es muy limitado, lo que afecta la salud de millones de personas.</w:t>
-            </w:r>
-          </w:p>
-          <w:p>
-            <w:pPr>
-              <w:spacing w:line="360" w:lineRule="auto"/>
-              <w:jc w:val="both"/>
-              <w:rPr>
-                <w:rFonts w:ascii="Arial" w:hAnsi="Arial" w:eastAsia="Arial" w:cs="Arial"/>
-              </w:rPr>
-            </w:pPr>
-            <w:r>
-              <w:rPr>
-                <w:rFonts w:hint="default" w:ascii="Arial" w:hAnsi="Arial" w:eastAsia="Arial" w:cs="Arial"/>
-              </w:rPr>
-              <w:t>Conclusión: Por lo tanto, los inventos médicos desarrollados gracias a la IA podrían ayudar a reducir las desigualdades en salud en México, llevando diagnósticos y atención a lugares donde hoy no llegan.</w:t>
+              <w:t>Conclusión: Por eso, estos inventos médicos que ha generado la IA podrían llegar a esas comunidades donde hoy no hay especialistas y ayudar a mejorar la salud de muchos mexicanos.</w:t>
             </w:r>
           </w:p>
         </w:tc>
@@ -1167,7 +1148,24 @@
               <w:rPr>
                 <w:rFonts w:hint="default" w:ascii="Arial" w:hAnsi="Arial" w:eastAsia="Arial" w:cs="Arial"/>
               </w:rPr>
-              <w:t>La inteligencia artificial y los inventos que está generando en México.</w:t>
+              <w:t>La inteligencia artificial y los inventos que está generando en México</w:t>
+            </w:r>
+            <w:bookmarkStart w:id="0" w:name="_GoBack"/>
+            <w:bookmarkEnd w:id="0"/>
+          </w:p>
+          <w:p>
+            <w:pPr>
+              <w:spacing w:line="360" w:lineRule="auto"/>
+              <w:jc w:val="both"/>
+              <w:rPr>
+                <w:rFonts w:hint="default" w:ascii="Arial" w:hAnsi="Arial" w:eastAsia="Arial" w:cs="Arial"/>
+              </w:rPr>
+            </w:pPr>
+            <w:r>
+              <w:rPr>
+                <w:rFonts w:hint="default" w:ascii="Arial" w:hAnsi="Arial" w:eastAsia="Arial" w:cs="Arial"/>
+              </w:rPr>
+              <w:t>La inteligencia artificial (IA) es uno de los avances científicos más importantes de los últimos tiempos. Gracias a años de investigación en informática y programación, los científicos lograron crear sistemas capaces de aprender y tomar decisiones por sí solos, y eso dio origen a muchos inventos que hoy están cambiando la manera en que las personas trabajan y estudian en México.</w:t>
             </w:r>
           </w:p>
           <w:p>
@@ -1182,7 +1180,7 @@
               <w:rPr>
                 <w:rFonts w:hint="default" w:ascii="Arial" w:hAnsi="Arial" w:eastAsia="Arial" w:cs="Arial"/>
               </w:rPr>
-              <w:t>La inteligencia artificial (IA) es uno de los avances científicos más importantes de nuestra época. Su desarrollo comenzó con investigaciones matemáticas e informáticas en el siglo XX y hoy ha dado origen a inventos que están cambiando la manera en que vivimos, trabajamos y estudiamos. En México, estos cambios ya se están haciendo presentes en distintas áreas de la sociedad.</w:t>
+              <w:t>Desde el punto de vista de la informática, la IA funciona gracias a algoritmos y programas que permiten a las computadoras aprender de los datos y resolver problemas. Esa investigación científica ha generado inventos como las plataformas educativas en línea, los traductores automáticos y los asistentes virtuales que ayudan a los estudiantes. Según la UNESCO (2021), la IA puede mejorar el acceso a la educación en países en desarrollo como México, ya que hay regiones donde hay muy pocos maestros o recursos educativos. Por eso considero que estos inventos son muy importantes para el país.</w:t>
             </w:r>
           </w:p>
           <w:p>
@@ -1197,7 +1195,7 @@
               <w:rPr>
                 <w:rFonts w:hint="default" w:ascii="Arial" w:hAnsi="Arial" w:eastAsia="Arial" w:cs="Arial"/>
               </w:rPr>
-              <w:t>Desde el punto de vista de la informática, la IA funciona gracias a programas y algoritmos que permiten a las máquinas aprender y tomar decisiones. Esta investigación científica ha generado inventos como los asistentes virtuales, los sistemas de reconocimiento de voz y las plataformas de aprendizaje automatizado. Gracias a estos inventos, los estudiantes mexicanos pueden acceder a información de forma más rápida y personalizada, lo cual es especialmente importante en un país donde hay regiones con pocos recursos educativos. La UNESCO (2021) señala que la IA puede ser una herramienta poderosa para mejorar el acceso a la educación en países en desarrollo como México.</w:t>
+              <w:t>Desde la sociología, la IA también está cambiando la forma en que las personas trabajan. De acuerdo con la CEPAL (2020), en México y América Latina millones de empleos con tareas repetitivas están en riesgo de ser reemplazados por máquinas y sistemas automatizados que son inventos de la IA. Esto me parece muy importante porque significa que muchos trabajadores mexicanos podrían perder su empleo si no se preparan para estos cambios.</w:t>
             </w:r>
           </w:p>
           <w:p>
@@ -1212,7 +1210,7 @@
               <w:rPr>
                 <w:rFonts w:hint="default" w:ascii="Arial" w:hAnsi="Arial" w:eastAsia="Arial" w:cs="Arial"/>
               </w:rPr>
-              <w:t>Desde la sociología, la IA está cambiando las relaciones entre las personas y el trabajo. La CEPAL (2020) advierte que en América Latina, incluyendo México, millones de empleos con tareas repetitivas están en riesgo de ser reemplazados por sistemas automatizados. Esto no significa que la IA sea mala, sino que la sociedad necesita prepararse con nuevas habilidades para aprovechar sus beneficios. Además, en el área de la salud, los inventos médicos impulsados por la IA podrían llegar a comunidades rurales mexicanas que hoy no tienen acceso a especialistas, según datos del INEGI (2023).</w:t>
+              <w:t>Además, la IA ha generado inventos médicos como sistemas que ayudan a detectar enfermedades y herramientas que apoyan a los médicos en sus diagnósticos. Según el INEGI (2023), en México hay muchas comunidades rurales donde el acceso a especialistas es muy limitado, por eso estos inventos podrían llegar a esos lugares y mejorar la salud de muchos mexicanos.</w:t>
             </w:r>
           </w:p>
           <w:p>
@@ -1227,7 +1225,7 @@
               <w:rPr>
                 <w:rFonts w:hint="default" w:ascii="Arial" w:hAnsi="Arial" w:eastAsia="Arial" w:cs="Arial"/>
               </w:rPr>
-              <w:t>En conclusión, la inteligencia artificial es un invento nacido de la investigación científica que, a su vez, sigue generando nuevos inventos en áreas como la educación, el trabajo y la salud. En México, la clave está en usarla de forma responsable, preparando a las personas para enfrentar sus retos y aprovechar todo lo que puede ofrecer.</w:t>
+              <w:t>En conclusión, la inteligencia artificial es un invento que surgió de la investigación científica en informática y que, a su vez, sigue generando nuevos inventos que están transformando la educación, el trabajo y la salud en México. Considero que es muy importante que como sociedad aprendamos a usarla bien para aprovechar todo lo que puede ofrecer.</w:t>
             </w:r>
           </w:p>
           <w:p>

</xml_diff>